<commit_message>
Record manuscript outlier selection, add means figure script, regenerate results
Adds a 'manuscript' preset to select_outliers.py (all flagged strides plus P024 ankle DF,
ankle rotation and foot progression excluded) with reasons in the note column, makes it the
default, and regenerates the equivalence/LoA results and figures. Adds 06_plot_means.py,
a Python version of the manuscript grand mean +/- SD figure.

Co-Authored-By: Claude Sonnet 5.5 <noreply@anthropic.com>
Claude-Session: https://claude.ai/code/session_015w9XBhFVNXRPjuHceetm3n
</commit_message>
<xml_diff>
--- a/python_analysis/results/table1_5deg.docx
+++ b/python_analysis/results/table1_5deg.docx
@@ -372,7 +372,7 @@
           </w:tcPr>
           <w:p>
             <w:r>
-              <w:t>30</w:t>
+              <w:t>29</w:t>
             </w:r>
           </w:p>
         </w:tc>
@@ -690,7 +690,7 @@
           </w:tcPr>
           <w:p>
             <w:r>
-              <w:t>24</w:t>
+              <w:t>23</w:t>
             </w:r>
           </w:p>
         </w:tc>
@@ -710,7 +710,7 @@
           </w:tcPr>
           <w:p>
             <w:r>
-              <w:t>62</w:t>
+              <w:t>63</w:t>
             </w:r>
           </w:p>
         </w:tc>
@@ -730,7 +730,7 @@
           </w:tcPr>
           <w:p>
             <w:r>
-              <w:t>31</w:t>
+              <w:t>30</w:t>
             </w:r>
           </w:p>
         </w:tc>
@@ -740,7 +740,7 @@
           </w:tcPr>
           <w:p>
             <w:r>
-              <w:t>83</w:t>
+              <w:t>85</w:t>
             </w:r>
           </w:p>
         </w:tc>
@@ -750,7 +750,7 @@
           </w:tcPr>
           <w:p>
             <w:r>
-              <w:t>8–51; 68–86</w:t>
+              <w:t>8–51; 67–86</w:t>
             </w:r>
           </w:p>
         </w:tc>
@@ -874,7 +874,7 @@
           </w:tcPr>
           <w:p>
             <w:r>
-              <w:t>24</w:t>
+              <w:t>23</w:t>
             </w:r>
           </w:p>
         </w:tc>
@@ -894,7 +894,7 @@
           </w:tcPr>
           <w:p>
             <w:r>
-              <w:t>18</w:t>
+              <w:t>15</w:t>
             </w:r>
           </w:p>
         </w:tc>
@@ -914,7 +914,7 @@
           </w:tcPr>
           <w:p>
             <w:r>
-              <w:t>45</w:t>
+              <w:t>48</w:t>
             </w:r>
           </w:p>
         </w:tc>
@@ -924,7 +924,7 @@
           </w:tcPr>
           <w:p>
             <w:r>
-              <w:t>61</w:t>
+              <w:t>64</w:t>
             </w:r>
           </w:p>
         </w:tc>
@@ -934,7 +934,7 @@
           </w:tcPr>
           <w:p>
             <w:r>
-              <w:t>13–24; 48–53</w:t>
+              <w:t>12–23; 52–54</w:t>
             </w:r>
           </w:p>
         </w:tc>
@@ -986,7 +986,7 @@
           </w:tcPr>
           <w:p>
             <w:r>
-              <w:t>15</w:t>
+              <w:t>14</w:t>
             </w:r>
           </w:p>
         </w:tc>
@@ -1006,7 +1006,7 @@
           </w:tcPr>
           <w:p>
             <w:r>
-              <w:t>85</w:t>
+              <w:t>86</w:t>
             </w:r>
           </w:p>
         </w:tc>
@@ -1016,7 +1016,7 @@
           </w:tcPr>
           <w:p>
             <w:r>
-              <w:t>28</w:t>
+              <w:t>26</w:t>
             </w:r>
           </w:p>
         </w:tc>
@@ -1026,7 +1026,7 @@
           </w:tcPr>
           <w:p>
             <w:r>
-              <w:t>25–27; 58–60; 78–84; 89–90</w:t>
+              <w:t>25–28; 58–59; 79–84; 89–90</w:t>
             </w:r>
           </w:p>
         </w:tc>
@@ -1108,7 +1108,7 @@
           </w:tcPr>
           <w:p>
             <w:r>
-              <w:t>81</w:t>
+              <w:t>84</w:t>
             </w:r>
           </w:p>
         </w:tc>
@@ -1180,7 +1180,7 @@
           </w:tcPr>
           <w:p>
             <w:r>
-              <w:t>19</w:t>
+              <w:t>17</w:t>
             </w:r>
           </w:p>
         </w:tc>
@@ -1190,7 +1190,7 @@
           </w:tcPr>
           <w:p>
             <w:r>
-              <w:t>81</w:t>
+              <w:t>83</w:t>
             </w:r>
           </w:p>
         </w:tc>

</xml_diff>

<commit_message>
Share one outlier selection between the ML-vs-MB and variance analyses
Adds a scope column to outlier_selection.csv: 'all' removes a flagged stride from every
variable and both systems and drops excluded participants entirely (default, matches the
variance analysis); 'variable' keeps the earlier per-variable, MB-only behaviour. The
variance analysis now reads the same file (--exclusions detect keeps the old rule),
and python_analysis results/figures are regenerated under the matched default.

Co-Authored-By: Claude Sonnet 5.5 <noreply@anthropic.com>
Claude-Session: https://claude.ai/code/session_015w9XBhFVNXRPjuHceetm3n
</commit_message>
<xml_diff>
--- a/python_analysis/results/table1_5deg.docx
+++ b/python_analysis/results/table1_5deg.docx
@@ -138,7 +138,7 @@
           </w:tcPr>
           <w:p>
             <w:r>
-              <w:t>24</w:t>
+              <w:t>23</w:t>
             </w:r>
           </w:p>
         </w:tc>
@@ -188,7 +188,7 @@
           </w:tcPr>
           <w:p>
             <w:r>
-              <w:t>63</w:t>
+              <w:t>64</w:t>
             </w:r>
           </w:p>
         </w:tc>
@@ -230,7 +230,7 @@
           </w:tcPr>
           <w:p>
             <w:r>
-              <w:t>24</w:t>
+              <w:t>23</w:t>
             </w:r>
           </w:p>
         </w:tc>
@@ -250,7 +250,7 @@
           </w:tcPr>
           <w:p>
             <w:r>
-              <w:t>85</w:t>
+              <w:t>82</w:t>
             </w:r>
           </w:p>
         </w:tc>
@@ -270,7 +270,7 @@
           </w:tcPr>
           <w:p>
             <w:r>
-              <w:t>15</w:t>
+              <w:t>18</w:t>
             </w:r>
           </w:p>
         </w:tc>
@@ -280,7 +280,7 @@
           </w:tcPr>
           <w:p>
             <w:r>
-              <w:t>57</w:t>
+              <w:t>58</w:t>
             </w:r>
           </w:p>
         </w:tc>
@@ -290,7 +290,7 @@
           </w:tcPr>
           <w:p>
             <w:r>
-              <w:t>0–19; 35–100</w:t>
+              <w:t>0–19; 35–75; 79–100</w:t>
             </w:r>
           </w:p>
         </w:tc>
@@ -322,99 +322,7 @@
           </w:tcPr>
           <w:p>
             <w:r>
-              <w:t>24</w:t>
-            </w:r>
-          </w:p>
-        </w:tc>
-        <w:tc>
-          <w:tcPr>
-            <w:tcW w:type="dxa" w:w="960"/>
-          </w:tcPr>
-          <w:p>
-            <w:r>
-              <w:t>No</w:t>
-            </w:r>
-          </w:p>
-        </w:tc>
-        <w:tc>
-          <w:tcPr>
-            <w:tcW w:type="dxa" w:w="960"/>
-          </w:tcPr>
-          <w:p>
-            <w:r>
-              <w:t>81</w:t>
-            </w:r>
-          </w:p>
-        </w:tc>
-        <w:tc>
-          <w:tcPr>
-            <w:tcW w:type="dxa" w:w="960"/>
-          </w:tcPr>
-          <w:p>
-            <w:r>
-              <w:t>0</w:t>
-            </w:r>
-          </w:p>
-        </w:tc>
-        <w:tc>
-          <w:tcPr>
-            <w:tcW w:type="dxa" w:w="960"/>
-          </w:tcPr>
-          <w:p>
-            <w:r>
-              <w:t>19</w:t>
-            </w:r>
-          </w:p>
-        </w:tc>
-        <w:tc>
-          <w:tcPr>
-            <w:tcW w:type="dxa" w:w="960"/>
-          </w:tcPr>
-          <w:p>
-            <w:r>
-              <w:t>29</w:t>
-            </w:r>
-          </w:p>
-        </w:tc>
-        <w:tc>
-          <w:tcPr>
-            <w:tcW w:type="dxa" w:w="960"/>
-          </w:tcPr>
-          <w:p>
-            <w:r>
-              <w:t>0–61; 81–100</w:t>
-            </w:r>
-          </w:p>
-        </w:tc>
-      </w:tr>
-      <w:tr>
-        <w:tc>
-          <w:tcPr>
-            <w:tcW w:type="dxa" w:w="960"/>
-          </w:tcPr>
-          <w:p>
-            <w:r>
-              <w:t>Knee Flexion</w:t>
-            </w:r>
-          </w:p>
-        </w:tc>
-        <w:tc>
-          <w:tcPr>
-            <w:tcW w:type="dxa" w:w="960"/>
-          </w:tcPr>
-          <w:p>
-            <w:r>
-              <w:t>5</w:t>
-            </w:r>
-          </w:p>
-        </w:tc>
-        <w:tc>
-          <w:tcPr>
-            <w:tcW w:type="dxa" w:w="960"/>
-          </w:tcPr>
-          <w:p>
-            <w:r>
-              <w:t>24</w:t>
+              <w:t>23</w:t>
             </w:r>
           </w:p>
         </w:tc>
@@ -464,6 +372,98 @@
           </w:tcPr>
           <w:p>
             <w:r>
+              <w:t>30</w:t>
+            </w:r>
+          </w:p>
+        </w:tc>
+        <w:tc>
+          <w:tcPr>
+            <w:tcW w:type="dxa" w:w="960"/>
+          </w:tcPr>
+          <w:p>
+            <w:r>
+              <w:t>0–7; 10–60; 82–100</w:t>
+            </w:r>
+          </w:p>
+        </w:tc>
+      </w:tr>
+      <w:tr>
+        <w:tc>
+          <w:tcPr>
+            <w:tcW w:type="dxa" w:w="960"/>
+          </w:tcPr>
+          <w:p>
+            <w:r>
+              <w:t>Knee Flexion</w:t>
+            </w:r>
+          </w:p>
+        </w:tc>
+        <w:tc>
+          <w:tcPr>
+            <w:tcW w:type="dxa" w:w="960"/>
+          </w:tcPr>
+          <w:p>
+            <w:r>
+              <w:t>5</w:t>
+            </w:r>
+          </w:p>
+        </w:tc>
+        <w:tc>
+          <w:tcPr>
+            <w:tcW w:type="dxa" w:w="960"/>
+          </w:tcPr>
+          <w:p>
+            <w:r>
+              <w:t>23</w:t>
+            </w:r>
+          </w:p>
+        </w:tc>
+        <w:tc>
+          <w:tcPr>
+            <w:tcW w:type="dxa" w:w="960"/>
+          </w:tcPr>
+          <w:p>
+            <w:r>
+              <w:t>No</w:t>
+            </w:r>
+          </w:p>
+        </w:tc>
+        <w:tc>
+          <w:tcPr>
+            <w:tcW w:type="dxa" w:w="960"/>
+          </w:tcPr>
+          <w:p>
+            <w:r>
+              <w:t>76</w:t>
+            </w:r>
+          </w:p>
+        </w:tc>
+        <w:tc>
+          <w:tcPr>
+            <w:tcW w:type="dxa" w:w="960"/>
+          </w:tcPr>
+          <w:p>
+            <w:r>
+              <w:t>0</w:t>
+            </w:r>
+          </w:p>
+        </w:tc>
+        <w:tc>
+          <w:tcPr>
+            <w:tcW w:type="dxa" w:w="960"/>
+          </w:tcPr>
+          <w:p>
+            <w:r>
+              <w:t>24</w:t>
+            </w:r>
+          </w:p>
+        </w:tc>
+        <w:tc>
+          <w:tcPr>
+            <w:tcW w:type="dxa" w:w="960"/>
+          </w:tcPr>
+          <w:p>
+            <w:r>
               <w:t>45</w:t>
             </w:r>
           </w:p>
@@ -474,7 +474,7 @@
           </w:tcPr>
           <w:p>
             <w:r>
-              <w:t>0–56; 70–84; 95–100</w:t>
+              <w:t>0–56; 71–84; 95–100</w:t>
             </w:r>
           </w:p>
         </w:tc>
@@ -506,7 +506,7 @@
           </w:tcPr>
           <w:p>
             <w:r>
-              <w:t>24</w:t>
+              <w:t>23</w:t>
             </w:r>
           </w:p>
         </w:tc>
@@ -526,7 +526,7 @@
           </w:tcPr>
           <w:p>
             <w:r>
-              <w:t>72</w:t>
+              <w:t>70</w:t>
             </w:r>
           </w:p>
         </w:tc>
@@ -546,7 +546,7 @@
           </w:tcPr>
           <w:p>
             <w:r>
-              <w:t>28</w:t>
+              <w:t>30</w:t>
             </w:r>
           </w:p>
         </w:tc>
@@ -556,7 +556,7 @@
           </w:tcPr>
           <w:p>
             <w:r>
-              <w:t>84</w:t>
+              <w:t>83</w:t>
             </w:r>
           </w:p>
         </w:tc>
@@ -566,7 +566,7 @@
           </w:tcPr>
           <w:p>
             <w:r>
-              <w:t>6–78</w:t>
+              <w:t>7–77</w:t>
             </w:r>
           </w:p>
         </w:tc>
@@ -598,7 +598,7 @@
           </w:tcPr>
           <w:p>
             <w:r>
-              <w:t>24</w:t>
+              <w:t>23</w:t>
             </w:r>
           </w:p>
         </w:tc>
@@ -618,7 +618,7 @@
           </w:tcPr>
           <w:p>
             <w:r>
-              <w:t>64</w:t>
+              <w:t>66</w:t>
             </w:r>
           </w:p>
         </w:tc>
@@ -638,7 +638,7 @@
           </w:tcPr>
           <w:p>
             <w:r>
-              <w:t>36</w:t>
+              <w:t>34</w:t>
             </w:r>
           </w:p>
         </w:tc>
@@ -648,7 +648,7 @@
           </w:tcPr>
           <w:p>
             <w:r>
-              <w:t>29</w:t>
+              <w:t>26</w:t>
             </w:r>
           </w:p>
         </w:tc>
@@ -658,7 +658,7 @@
           </w:tcPr>
           <w:p>
             <w:r>
-              <w:t>5–35; 55–88</w:t>
+              <w:t>5–36; 54–88</w:t>
             </w:r>
           </w:p>
         </w:tc>
@@ -740,7 +740,7 @@
           </w:tcPr>
           <w:p>
             <w:r>
-              <w:t>85</w:t>
+              <w:t>86</w:t>
             </w:r>
           </w:p>
         </w:tc>
@@ -782,7 +782,7 @@
           </w:tcPr>
           <w:p>
             <w:r>
-              <w:t>24</w:t>
+              <w:t>23</w:t>
             </w:r>
           </w:p>
         </w:tc>
@@ -802,7 +802,7 @@
           </w:tcPr>
           <w:p>
             <w:r>
-              <w:t>57</w:t>
+              <w:t>55</w:t>
             </w:r>
           </w:p>
         </w:tc>
@@ -822,7 +822,7 @@
           </w:tcPr>
           <w:p>
             <w:r>
-              <w:t>43</w:t>
+              <w:t>45</w:t>
             </w:r>
           </w:p>
         </w:tc>
@@ -832,7 +832,7 @@
           </w:tcPr>
           <w:p>
             <w:r>
-              <w:t>26</w:t>
+              <w:t>28</w:t>
             </w:r>
           </w:p>
         </w:tc>
@@ -842,7 +842,7 @@
           </w:tcPr>
           <w:p>
             <w:r>
-              <w:t>0–32; 54–60; 83–100</w:t>
+              <w:t>0–33; 54–59; 85–100</w:t>
             </w:r>
           </w:p>
         </w:tc>
@@ -966,7 +966,7 @@
           </w:tcPr>
           <w:p>
             <w:r>
-              <w:t>24</w:t>
+              <w:t>23</w:t>
             </w:r>
           </w:p>
         </w:tc>
@@ -986,7 +986,7 @@
           </w:tcPr>
           <w:p>
             <w:r>
-              <w:t>14</w:t>
+              <w:t>11</w:t>
             </w:r>
           </w:p>
         </w:tc>
@@ -996,7 +996,7 @@
           </w:tcPr>
           <w:p>
             <w:r>
-              <w:t>0</w:t>
+              <w:t>4</w:t>
             </w:r>
           </w:p>
         </w:tc>
@@ -1006,7 +1006,7 @@
           </w:tcPr>
           <w:p>
             <w:r>
-              <w:t>86</w:t>
+              <w:t>85</w:t>
             </w:r>
           </w:p>
         </w:tc>
@@ -1016,7 +1016,7 @@
           </w:tcPr>
           <w:p>
             <w:r>
-              <w:t>26</w:t>
+              <w:t>21</w:t>
             </w:r>
           </w:p>
         </w:tc>
@@ -1026,7 +1026,7 @@
           </w:tcPr>
           <w:p>
             <w:r>
-              <w:t>25–28; 58–59; 79–84; 89–90</w:t>
+              <w:t>26–27; 59–59; 79–84; 89–90</w:t>
             </w:r>
           </w:p>
         </w:tc>
@@ -1058,7 +1058,7 @@
           </w:tcPr>
           <w:p>
             <w:r>
-              <w:t>24</w:t>
+              <w:t>23</w:t>
             </w:r>
           </w:p>
         </w:tc>

</xml_diff>